<commit_message>
Fiche modèle V2 recréée sur le malgache vérifié (page Rano collée)
- src/data_modele.py : le gabarit refait, énoncé par énoncé, adossé aux attestations
- sources_web/full/mgwiki_rano.txt + clé mgwiki_rano : la page entière, non nettoyée
- sabunina -> savony (41 pages, article dédié) et fandroavana -> fanadiovana dans les 7 modules de données ;
  aucun des deux mots ne reste dans un .docx
- CARNET (+9 lignes), LISTE-ROUGE (+3), PAGES_MG (recette de copie), README (section V2)
- --rouge ne balaie plus que les littéraux des données : une faute citée pour être expliquée n'est pas écrite
- 8 .docx TUATUA (106 invariants pour le modèle, 217 pour un thème)

Co-authored-by: arena-agent <297053741+arena-agent@users.noreply.github.com>
</commit_message>
<xml_diff>
--- a/manuel-malagasy-t5/output/Echantillon_Malagasy_T5_V1.docx
+++ b/manuel-malagasy-t5/output/Echantillon_Malagasy_T5_V1.docx
@@ -1054,7 +1054,7 @@
                 <w:color w:val="000000"/>
                 <w:sz w:val="20"/>
               </w:rPr>
-              <w:t>3. Rano madio sy sabonina, ary lamba madio ho an'ny fandroavana.</w:t>
+              <w:t>3. Rano madio sy savony, ary lamba madio ho an'ny fanadiovana.</w:t>
             </w:r>
           </w:p>
         </w:tc>
@@ -1397,7 +1397,7 @@
                 <w:color w:val="000000"/>
                 <w:sz w:val="20"/>
               </w:rPr>
-              <w:t>Jereo aloha ny lohateny, ny isa ny fehezanteny, ary ny sary ao anaty lahatsoratra.</w:t>
+              <w:t>Jereo aloha ny lohateny, ny isa ny fehezanteny, ary ny mari-piatoana ampiasaina ao.</w:t>
             </w:r>
           </w:p>
         </w:tc>
@@ -1668,7 +1668,7 @@
                 <w:color w:val="1F4E79"/>
                 <w:sz w:val="20"/>
               </w:rPr>
-              <w:t>fanasana ny tanana amin'ny sabonina sy rano madio</w:t>
+              <w:t>fanasana ny tanana amin'ny savony sy rano madio</w:t>
             </w:r>
             <w:r>
               <w:rPr>
@@ -1796,7 +1796,7 @@
                 <w:color w:val="000000"/>
                 <w:sz w:val="20"/>
               </w:rPr>
-              <w:t>Koa, ny fanasana ny tanana amin'ny sabonina sy rano madio, indrindra alohan'ny mihinana ary rehefa miverina avy any an-dokoa, dia fomba mora sy azo atao isan'andro hiarovana ny fahasalamana.</w:t>
+              <w:t>Koa, ny fanasana ny tanana amin'ny savony sy rano madio, indrindra alohan'ny mihinana ary rehefa miverina avy any an-dokoa, dia fomba mora sy azo atao isan'andro hiarovana ny fahasalamana.</w:t>
             </w:r>
           </w:p>
         </w:tc>
@@ -1999,7 +1999,7 @@
                 <w:color w:val="000000"/>
                 <w:sz w:val="20"/>
               </w:rPr>
-              <w:t>a) sabonina</w:t>
+              <w:t>a) savony</w:t>
             </w:r>
           </w:p>
           <w:p>
@@ -2111,7 +2111,7 @@
                 <w:color w:val="000000"/>
                 <w:sz w:val="20"/>
               </w:rPr>
-              <w:t>4) zava-piasana amin'ny fandroavana ny tanana</w:t>
+              <w:t>4) zava-piasana amin'ny fanadiovana ny tanana</w:t>
             </w:r>
           </w:p>
         </w:tc>
@@ -2147,7 +2147,7 @@
                 <w:color w:val="000000"/>
                 <w:sz w:val="20"/>
               </w:rPr>
-              <w:t>a) sabonina</w:t>
+              <w:t>a) savony</w:t>
             </w:r>
           </w:p>
           <w:p>
@@ -2442,7 +2442,7 @@
                 <w:color w:val="000000"/>
                 <w:sz w:val="20"/>
               </w:rPr>
-              <w:t>1. Rano madio no ampiasaina vao misy sabonina.</w:t>
+              <w:t>1. Rano madio no ampiasaina vao misy savony.</w:t>
             </w:r>
           </w:p>
           <w:p>
@@ -2588,7 +2588,7 @@
           <w:color w:val="000000"/>
           <w:sz w:val="22"/>
         </w:rPr>
-        <w:t>Isika rehetra dia tia ho salama. Ny fanasana ny tanana amin'ny sabonina sy rano madio no fomba mora indrindra hiarovana ny tena. Mazotoa manasa tanana alohan'ny mihinana, ary rehefa miverina avy any an-dokoa. Aza adino ny lanin-tanana sy ny lamosin-tanana, ary ny eo anelanelan'ny rantsan-tanana. Avy amin'ny tanana maloto ny antony amin'ny be dia be amin'ny aretin-kibo sy ny aretin-koditra.</w:t>
+        <w:t>Isika rehetra dia tia ho salama. Ny fanasana ny tanana amin'ny savony sy rano madio no fomba mora indrindra hiarovana ny tena. Mazotoa manasa tanana alohan'ny mihinana, ary rehefa miverina avy any an-dokoa. Aza adino ny lanin-tanana sy ny lamosin-tanana, ary ny eo anelanelan'ny rantsan-tanana. Avy amin'ny tanana maloto ny antony amin'ny be dia be amin'ny aretin-kibo sy ny aretin-koditra.</w:t>
       </w:r>
     </w:p>
     <w:p>
@@ -2627,7 +2627,7 @@
           <w:color w:val="000000"/>
           <w:sz w:val="22"/>
         </w:rPr>
-        <w:t xml:space="preserve"> : ny fampiasana rano sy sabonina hanesorana ny maloto ; </w:t>
+        <w:t xml:space="preserve"> : ny fampiasana rano sy savony hanesorana ny maloto ; </w:t>
       </w:r>
       <w:r>
         <w:rPr>
@@ -2636,7 +2636,7 @@
           <w:color w:val="1F4E79"/>
           <w:sz w:val="22"/>
         </w:rPr>
-        <w:t>sabonina</w:t>
+        <w:t>savony</w:t>
       </w:r>
       <w:r>
         <w:rPr>
@@ -2646,7 +2646,7 @@
           <w:color w:val="000000"/>
           <w:sz w:val="22"/>
         </w:rPr>
-        <w:t xml:space="preserve"> : zavatra ampiasaina amin'ny fanadiovana ; </w:t>
+        <w:t xml:space="preserve"> : akora ampiasaina amin'ny fanadiovana sy fandamana ; </w:t>
       </w:r>
       <w:r>
         <w:rPr>
@@ -2828,7 +2828,7 @@
           <w:color w:val="000000"/>
           <w:sz w:val="22"/>
         </w:rPr>
-        <w:t>• Manasa tanana amin'ny sabonina sy rano madio isika alohan'ny mihinana.</w:t>
+        <w:t>• Manasa tanana amin'ny savony sy rano madio isika alohan'ny mihinana.</w:t>
       </w:r>
     </w:p>
     <w:p>
@@ -3065,7 +3065,7 @@
           <w:color w:val="000000"/>
           <w:sz w:val="22"/>
         </w:rPr>
-        <w:t>1) Ny sabonina ihany ilaina, tsy mila rano ny fanasana tanana.</w:t>
+        <w:t>1) Ny savony ihany ilaina, tsy mila rano ny fanasana tanana.</w:t>
       </w:r>
     </w:p>
     <w:p>
@@ -3191,7 +3191,7 @@
           <w:color w:val="000000"/>
           <w:sz w:val="22"/>
         </w:rPr>
-        <w:t>2) sabonina</w:t>
+        <w:t>2) savony</w:t>
       </w:r>
     </w:p>
     <w:p>
@@ -3279,7 +3279,7 @@
           <w:color w:val="C2185B"/>
           <w:sz w:val="22"/>
         </w:rPr>
-        <w:t>fanasana ny tanana amin'ny sabonina sy rano madio</w:t>
+        <w:t>fanasana ny tanana amin'ny savony sy rano madio</w:t>
       </w:r>
       <w:r>
         <w:rPr>
@@ -3517,7 +3517,7 @@
           <w:color w:val="000000"/>
           <w:sz w:val="22"/>
         </w:rPr>
-        <w:t xml:space="preserve"> : ilaina ny sabonina </w:t>
+        <w:t xml:space="preserve"> : ilaina ny savony </w:t>
       </w:r>
       <w:r>
         <w:rPr>
@@ -3672,7 +3672,7 @@
           <w:color w:val="000000"/>
           <w:sz w:val="22"/>
         </w:rPr>
-        <w:t xml:space="preserve">1) ny fampiasana rano sy sabonina </w:t>
+        <w:t xml:space="preserve">1) ny fampiasana rano sy savony </w:t>
       </w:r>
       <w:r>
         <w:rPr>
@@ -3787,7 +3787,1303 @@
           <w:color w:val="000000"/>
           <w:sz w:val="20"/>
         </w:rPr>
-        <w:t>1. Wikipédia (fr) — « Hygiène des mains », encyclopédie en ligne, licence CC BY-SA 4.0</w:t>
+        <w:t>1. Wikipedia (mg) — « Rano », section « Fahasalamana », Wikipedia malagasy, vasontolo malalaka</w:t>
+      </w:r>
+    </w:p>
+    <w:p>
+      <w:pPr>
+        <w:spacing w:after="120"/>
+        <w:ind w:left="340"/>
+      </w:pPr>
+      <w:r>
+        <w:rPr>
+          <w:rFonts w:ascii="Times New Roman" w:hAnsi="Times New Roman"/>
+          <w:b w:val="0"/>
+          <w:i w:val="0"/>
+          <w:color w:val="1F4E79"/>
+          <w:sz w:val="18"/>
+        </w:rPr>
+        <w:t>https://mg.wikipedia.org/wiki/Rano</w:t>
+      </w:r>
+    </w:p>
+    <w:p>
+      <w:pPr>
+        <w:spacing w:after="60"/>
+        <w:ind w:left="510"/>
+      </w:pPr>
+      <w:r>
+        <w:rPr>
+          <w:rFonts w:ascii="Times New Roman" w:hAnsi="Times New Roman"/>
+          <w:b w:val="0"/>
+          <w:i/>
+          <w:color w:val="000000"/>
+          <w:sz w:val="20"/>
+        </w:rPr>
+        <w:t>« Ny rano dia sakafo mahavelona sy iankinan'ny aina. Ny 3/4 ny vatan'ny olombelona dia rano avokoa. Ary mila misotro rano isan'andro isika mba hikolokoloana an'io. »</w:t>
+      </w:r>
+    </w:p>
+    <w:p>
+      <w:pPr>
+        <w:spacing w:after="120"/>
+        <w:ind w:left="340"/>
+      </w:pPr>
+      <w:r>
+        <w:rPr>
+          <w:rFonts w:ascii="Times New Roman" w:hAnsi="Times New Roman"/>
+          <w:b/>
+          <w:i w:val="0"/>
+          <w:color w:val="1E7B34"/>
+          <w:sz w:val="18"/>
+        </w:rPr>
+        <w:t>Pejy fenony : ity manontolo ity, tsy misy nesorina na novana na ovaina.</w:t>
+      </w:r>
+    </w:p>
+    <w:p>
+      <w:pPr>
+        <w:spacing w:after="20"/>
+        <w:ind w:left="510"/>
+      </w:pPr>
+      <w:r>
+        <w:rPr>
+          <w:rFonts w:ascii="Times New Roman" w:hAnsi="Times New Roman"/>
+          <w:b w:val="0"/>
+          <w:i w:val="0"/>
+          <w:color w:val="000000"/>
+          <w:sz w:val="16"/>
+        </w:rPr>
+        <w:t>Rano</w:t>
+      </w:r>
+    </w:p>
+    <w:p>
+      <w:pPr>
+        <w:spacing w:after="20"/>
+        <w:ind w:left="510"/>
+      </w:pPr>
+      <w:r>
+        <w:rPr>
+          <w:rFonts w:ascii="Times New Roman" w:hAnsi="Times New Roman"/>
+          <w:b w:val="0"/>
+          <w:i w:val="0"/>
+          <w:color w:val="000000"/>
+          <w:sz w:val="16"/>
+        </w:rPr>
+        <w:t>Wikipedia</w:t>
+      </w:r>
+    </w:p>
+    <w:p>
+      <w:pPr>
+        <w:spacing w:after="20"/>
+        <w:ind w:left="510"/>
+      </w:pPr>
+      <w:r>
+        <w:rPr>
+          <w:rFonts w:ascii="Times New Roman" w:hAnsi="Times New Roman"/>
+          <w:b w:val="0"/>
+          <w:i w:val="0"/>
+          <w:color w:val="000000"/>
+          <w:sz w:val="16"/>
+        </w:rPr>
+        <w:t>Tadiavo</w:t>
+      </w:r>
+    </w:p>
+    <w:p>
+      <w:pPr>
+        <w:spacing w:after="20"/>
+        <w:ind w:left="510"/>
+      </w:pPr>
+      <w:r>
+        <w:rPr>
+          <w:rFonts w:ascii="Times New Roman" w:hAnsi="Times New Roman"/>
+          <w:b w:val="0"/>
+          <w:i w:val="0"/>
+          <w:color w:val="000000"/>
+          <w:sz w:val="16"/>
+        </w:rPr>
+        <w:t>Meniom-pikambana</w:t>
+      </w:r>
+    </w:p>
+    <w:p>
+      <w:pPr>
+        <w:spacing w:after="20"/>
+        <w:ind w:left="510"/>
+      </w:pPr>
+      <w:r>
+        <w:rPr>
+          <w:rFonts w:ascii="Times New Roman" w:hAnsi="Times New Roman"/>
+          <w:b w:val="0"/>
+          <w:i w:val="0"/>
+          <w:color w:val="000000"/>
+          <w:sz w:val="16"/>
+        </w:rPr>
+        <w:t>Rano</w:t>
+      </w:r>
+    </w:p>
+    <w:p>
+      <w:pPr>
+        <w:spacing w:after="20"/>
+        <w:ind w:left="510"/>
+      </w:pPr>
+      <w:r>
+        <w:rPr>
+          <w:rFonts w:ascii="Times New Roman" w:hAnsi="Times New Roman"/>
+          <w:b w:val="0"/>
+          <w:i w:val="0"/>
+          <w:color w:val="000000"/>
+          <w:sz w:val="16"/>
+        </w:rPr>
+        <w:t>Fiteny</w:t>
+      </w:r>
+    </w:p>
+    <w:p>
+      <w:pPr>
+        <w:spacing w:after="20"/>
+        <w:ind w:left="510"/>
+      </w:pPr>
+      <w:r>
+        <w:rPr>
+          <w:rFonts w:ascii="Times New Roman" w:hAnsi="Times New Roman"/>
+          <w:b w:val="0"/>
+          <w:i w:val="0"/>
+          <w:color w:val="000000"/>
+          <w:sz w:val="16"/>
+        </w:rPr>
+        <w:t>Enregistrer</w:t>
+      </w:r>
+    </w:p>
+    <w:p>
+      <w:pPr>
+        <w:spacing w:after="20"/>
+        <w:ind w:left="510"/>
+      </w:pPr>
+      <w:r>
+        <w:rPr>
+          <w:rFonts w:ascii="Times New Roman" w:hAnsi="Times New Roman"/>
+          <w:b w:val="0"/>
+          <w:i w:val="0"/>
+          <w:color w:val="000000"/>
+          <w:sz w:val="16"/>
+        </w:rPr>
+        <w:t>Ovaina</w:t>
+      </w:r>
+    </w:p>
+    <w:p>
+      <w:pPr>
+        <w:spacing w:after="20"/>
+        <w:ind w:left="510"/>
+      </w:pPr>
+      <w:r>
+        <w:rPr>
+          <w:rFonts w:ascii="Times New Roman" w:hAnsi="Times New Roman"/>
+          <w:b w:val="0"/>
+          <w:i w:val="0"/>
+          <w:color w:val="000000"/>
+          <w:sz w:val="16"/>
+        </w:rPr>
+        <w:t>Hisintona ny PDF</w:t>
+      </w:r>
+    </w:p>
+    <w:p>
+      <w:pPr>
+        <w:spacing w:after="20"/>
+        <w:ind w:left="510"/>
+      </w:pPr>
+      <w:r>
+        <w:rPr>
+          <w:rFonts w:ascii="Times New Roman" w:hAnsi="Times New Roman"/>
+          <w:b w:val="0"/>
+          <w:i w:val="0"/>
+          <w:color w:val="000000"/>
+          <w:sz w:val="16"/>
+        </w:rPr>
+        <w:t>Ny rano [1] dia akora iankinan'ny aina eto an-tany. Amin'ny mari-pana sy ny tsindry mahazatra dia miendrika zaka mitsiranoka izy. Fa hita amin'ny endrika mientona sy mivaingana koa izy eo amin'ny tontolo voajanahary.</w:t>
+      </w:r>
+    </w:p>
+    <w:p>
+      <w:pPr>
+        <w:spacing w:after="20"/>
+        <w:ind w:left="510"/>
+      </w:pPr>
+      <w:r>
+        <w:rPr>
+          <w:rFonts w:ascii="Times New Roman" w:hAnsi="Times New Roman"/>
+          <w:b w:val="0"/>
+          <w:i w:val="0"/>
+          <w:color w:val="000000"/>
+          <w:sz w:val="16"/>
+        </w:rPr>
+        <w:t>Aiza no ahitana rano</w:t>
+      </w:r>
+    </w:p>
+    <w:p>
+      <w:pPr>
+        <w:spacing w:after="20"/>
+        <w:ind w:left="510"/>
+      </w:pPr>
+      <w:r>
+        <w:rPr>
+          <w:rFonts w:ascii="Times New Roman" w:hAnsi="Times New Roman"/>
+          <w:b w:val="0"/>
+          <w:i w:val="0"/>
+          <w:color w:val="000000"/>
+          <w:sz w:val="16"/>
+        </w:rPr>
+        <w:t>hanova</w:t>
+      </w:r>
+    </w:p>
+    <w:p>
+      <w:pPr>
+        <w:spacing w:after="20"/>
+        <w:ind w:left="510"/>
+      </w:pPr>
+      <w:r>
+        <w:rPr>
+          <w:rFonts w:ascii="Times New Roman" w:hAnsi="Times New Roman"/>
+          <w:b w:val="0"/>
+          <w:i w:val="0"/>
+          <w:color w:val="000000"/>
+          <w:sz w:val="16"/>
+        </w:rPr>
+        <w:t>Amin'ny endrika mivaingana:</w:t>
+      </w:r>
+    </w:p>
+    <w:p>
+      <w:pPr>
+        <w:spacing w:after="20"/>
+        <w:ind w:left="510"/>
+      </w:pPr>
+      <w:r>
+        <w:rPr>
+          <w:rFonts w:ascii="Times New Roman" w:hAnsi="Times New Roman"/>
+          <w:b w:val="0"/>
+          <w:i w:val="0"/>
+          <w:color w:val="000000"/>
+          <w:sz w:val="16"/>
+        </w:rPr>
+        <w:t>any amin'ny tendron-tany atsimo sy avaratra</w:t>
+      </w:r>
+    </w:p>
+    <w:p>
+      <w:pPr>
+        <w:spacing w:after="20"/>
+        <w:ind w:left="510"/>
+      </w:pPr>
+      <w:r>
+        <w:rPr>
+          <w:rFonts w:ascii="Times New Roman" w:hAnsi="Times New Roman"/>
+          <w:b w:val="0"/>
+          <w:i w:val="0"/>
+          <w:color w:val="000000"/>
+          <w:sz w:val="16"/>
+        </w:rPr>
+        <w:t>any amin'ny faritra temperé rehefa ririnina izay miraraka amin'ny endrika orampanala</w:t>
+      </w:r>
+    </w:p>
+    <w:p>
+      <w:pPr>
+        <w:spacing w:after="20"/>
+        <w:ind w:left="510"/>
+      </w:pPr>
+      <w:r>
+        <w:rPr>
+          <w:rFonts w:ascii="Times New Roman" w:hAnsi="Times New Roman"/>
+          <w:b w:val="0"/>
+          <w:i w:val="0"/>
+          <w:color w:val="000000"/>
+          <w:sz w:val="16"/>
+        </w:rPr>
+        <w:t>eny ambony tendrombohitra avo toy ny Himalaya sy Kilimandjaro</w:t>
+      </w:r>
+    </w:p>
+    <w:p>
+      <w:pPr>
+        <w:spacing w:after="20"/>
+        <w:ind w:left="510"/>
+      </w:pPr>
+      <w:r>
+        <w:rPr>
+          <w:rFonts w:ascii="Times New Roman" w:hAnsi="Times New Roman"/>
+          <w:b w:val="0"/>
+          <w:i w:val="0"/>
+          <w:color w:val="000000"/>
+          <w:sz w:val="16"/>
+        </w:rPr>
+        <w:t>ao anaty vata fampangatsiahana, any amin'ny fivarotan-trondro</w:t>
+      </w:r>
+    </w:p>
+    <w:p>
+      <w:pPr>
+        <w:spacing w:after="20"/>
+        <w:ind w:left="510"/>
+      </w:pPr>
+      <w:r>
+        <w:rPr>
+          <w:rFonts w:ascii="Times New Roman" w:hAnsi="Times New Roman"/>
+          <w:b w:val="0"/>
+          <w:i w:val="0"/>
+          <w:color w:val="000000"/>
+          <w:sz w:val="16"/>
+        </w:rPr>
+        <w:t>amin'ny glasy sy klarinety ary yaourt amin'ny sase</w:t>
+      </w:r>
+    </w:p>
+    <w:p>
+      <w:pPr>
+        <w:spacing w:after="20"/>
+        <w:ind w:left="510"/>
+      </w:pPr>
+      <w:r>
+        <w:rPr>
+          <w:rFonts w:ascii="Times New Roman" w:hAnsi="Times New Roman"/>
+          <w:b w:val="0"/>
+          <w:i w:val="0"/>
+          <w:color w:val="000000"/>
+          <w:sz w:val="16"/>
+        </w:rPr>
+        <w:t>amin'ny endrika mitsiranoka:</w:t>
+      </w:r>
+    </w:p>
+    <w:p>
+      <w:pPr>
+        <w:spacing w:after="20"/>
+        <w:ind w:left="510"/>
+      </w:pPr>
+      <w:r>
+        <w:rPr>
+          <w:rFonts w:ascii="Times New Roman" w:hAnsi="Times New Roman"/>
+          <w:b w:val="0"/>
+          <w:i w:val="0"/>
+          <w:color w:val="000000"/>
+          <w:sz w:val="16"/>
+        </w:rPr>
+        <w:t>any anaty ranomasina</w:t>
+      </w:r>
+    </w:p>
+    <w:p>
+      <w:pPr>
+        <w:spacing w:after="20"/>
+        <w:ind w:left="510"/>
+      </w:pPr>
+      <w:r>
+        <w:rPr>
+          <w:rFonts w:ascii="Times New Roman" w:hAnsi="Times New Roman"/>
+          <w:b w:val="0"/>
+          <w:i w:val="0"/>
+          <w:color w:val="000000"/>
+          <w:sz w:val="16"/>
+        </w:rPr>
+        <w:t>any anaty ranomamy toy ny ony, farihy, tatatra, loharano, tanimbary sns</w:t>
+      </w:r>
+    </w:p>
+    <w:p>
+      <w:pPr>
+        <w:spacing w:after="20"/>
+        <w:ind w:left="510"/>
+      </w:pPr>
+      <w:r>
+        <w:rPr>
+          <w:rFonts w:ascii="Times New Roman" w:hAnsi="Times New Roman"/>
+          <w:b w:val="0"/>
+          <w:i w:val="0"/>
+          <w:color w:val="000000"/>
+          <w:sz w:val="16"/>
+        </w:rPr>
+        <w:t>any anatin'ny zava-manan'aina toy ny biby sy zavamaniry ary mikiraoba</w:t>
+      </w:r>
+    </w:p>
+    <w:p>
+      <w:pPr>
+        <w:spacing w:after="20"/>
+        <w:ind w:left="510"/>
+      </w:pPr>
+      <w:r>
+        <w:rPr>
+          <w:rFonts w:ascii="Times New Roman" w:hAnsi="Times New Roman"/>
+          <w:b w:val="0"/>
+          <w:i w:val="0"/>
+          <w:color w:val="000000"/>
+          <w:sz w:val="16"/>
+        </w:rPr>
+        <w:t>eny amin'ny habakabaka izay milatsaka ho orana</w:t>
+      </w:r>
+    </w:p>
+    <w:p>
+      <w:pPr>
+        <w:spacing w:after="20"/>
+        <w:ind w:left="510"/>
+      </w:pPr>
+      <w:r>
+        <w:rPr>
+          <w:rFonts w:ascii="Times New Roman" w:hAnsi="Times New Roman"/>
+          <w:b w:val="0"/>
+          <w:i w:val="0"/>
+          <w:color w:val="000000"/>
+          <w:sz w:val="16"/>
+        </w:rPr>
+        <w:t>any anaty tavoahangy</w:t>
+      </w:r>
+    </w:p>
+    <w:p>
+      <w:pPr>
+        <w:spacing w:after="20"/>
+        <w:ind w:left="510"/>
+      </w:pPr>
+      <w:r>
+        <w:rPr>
+          <w:rFonts w:ascii="Times New Roman" w:hAnsi="Times New Roman"/>
+          <w:b w:val="0"/>
+          <w:i w:val="0"/>
+          <w:color w:val="000000"/>
+          <w:sz w:val="16"/>
+        </w:rPr>
+        <w:t>amin'ny endrika mientona:</w:t>
+      </w:r>
+    </w:p>
+    <w:p>
+      <w:pPr>
+        <w:spacing w:after="20"/>
+        <w:ind w:left="510"/>
+      </w:pPr>
+      <w:r>
+        <w:rPr>
+          <w:rFonts w:ascii="Times New Roman" w:hAnsi="Times New Roman"/>
+          <w:b w:val="0"/>
+          <w:i w:val="0"/>
+          <w:color w:val="000000"/>
+          <w:sz w:val="16"/>
+        </w:rPr>
+        <w:t>anatin'ny atmosfera</w:t>
+      </w:r>
+    </w:p>
+    <w:p>
+      <w:pPr>
+        <w:spacing w:after="20"/>
+        <w:ind w:left="510"/>
+      </w:pPr>
+      <w:r>
+        <w:rPr>
+          <w:rFonts w:ascii="Times New Roman" w:hAnsi="Times New Roman"/>
+          <w:b w:val="0"/>
+          <w:i w:val="0"/>
+          <w:color w:val="000000"/>
+          <w:sz w:val="16"/>
+        </w:rPr>
+        <w:t>anatin'ny fofonaina</w:t>
+      </w:r>
+    </w:p>
+    <w:p>
+      <w:pPr>
+        <w:spacing w:after="20"/>
+        <w:ind w:left="510"/>
+      </w:pPr>
+      <w:r>
+        <w:rPr>
+          <w:rFonts w:ascii="Times New Roman" w:hAnsi="Times New Roman"/>
+          <w:b w:val="0"/>
+          <w:i w:val="0"/>
+          <w:color w:val="000000"/>
+          <w:sz w:val="16"/>
+        </w:rPr>
+        <w:t>eo am-bava-vilany</w:t>
+      </w:r>
+    </w:p>
+    <w:p>
+      <w:pPr>
+        <w:spacing w:after="20"/>
+        <w:ind w:left="510"/>
+      </w:pPr>
+      <w:r>
+        <w:rPr>
+          <w:rFonts w:ascii="Times New Roman" w:hAnsi="Times New Roman"/>
+          <w:b w:val="0"/>
+          <w:i w:val="0"/>
+          <w:color w:val="000000"/>
+          <w:sz w:val="16"/>
+        </w:rPr>
+        <w:t>Fizika</w:t>
+      </w:r>
+    </w:p>
+    <w:p>
+      <w:pPr>
+        <w:spacing w:after="20"/>
+        <w:ind w:left="510"/>
+      </w:pPr>
+      <w:r>
+        <w:rPr>
+          <w:rFonts w:ascii="Times New Roman" w:hAnsi="Times New Roman"/>
+          <w:b w:val="0"/>
+          <w:i w:val="0"/>
+          <w:color w:val="000000"/>
+          <w:sz w:val="16"/>
+        </w:rPr>
+        <w:t>hanova</w:t>
+      </w:r>
+    </w:p>
+    <w:p>
+      <w:pPr>
+        <w:spacing w:after="20"/>
+        <w:ind w:left="510"/>
+      </w:pPr>
+      <w:r>
+        <w:rPr>
+          <w:rFonts w:ascii="Times New Roman" w:hAnsi="Times New Roman"/>
+          <w:b w:val="0"/>
+          <w:i w:val="0"/>
+          <w:color w:val="000000"/>
+          <w:sz w:val="16"/>
+        </w:rPr>
+        <w:t>Amin'ny tsindrin'ny atimosifera dia:</w:t>
+      </w:r>
+    </w:p>
+    <w:p>
+      <w:pPr>
+        <w:spacing w:after="20"/>
+        <w:ind w:left="510"/>
+      </w:pPr>
+      <w:r>
+        <w:rPr>
+          <w:rFonts w:ascii="Times New Roman" w:hAnsi="Times New Roman"/>
+          <w:b w:val="0"/>
+          <w:i w:val="0"/>
+          <w:color w:val="000000"/>
+          <w:sz w:val="16"/>
+        </w:rPr>
+        <w:t>mari-pana fiempoana: 0°C</w:t>
+      </w:r>
+    </w:p>
+    <w:p>
+      <w:pPr>
+        <w:spacing w:after="20"/>
+        <w:ind w:left="510"/>
+      </w:pPr>
+      <w:r>
+        <w:rPr>
+          <w:rFonts w:ascii="Times New Roman" w:hAnsi="Times New Roman"/>
+          <w:b w:val="0"/>
+          <w:i w:val="0"/>
+          <w:color w:val="000000"/>
+          <w:sz w:val="16"/>
+        </w:rPr>
+        <w:t>mari-pana fientonana: 100°C</w:t>
+      </w:r>
+    </w:p>
+    <w:p>
+      <w:pPr>
+        <w:spacing w:after="20"/>
+        <w:ind w:left="510"/>
+      </w:pPr>
+      <w:r>
+        <w:rPr>
+          <w:rFonts w:ascii="Times New Roman" w:hAnsi="Times New Roman"/>
+          <w:b w:val="0"/>
+          <w:i w:val="0"/>
+          <w:color w:val="000000"/>
+          <w:sz w:val="16"/>
+        </w:rPr>
+        <w:t>mari-pana maha ambony indrindra ny hakitroka: 4°C</w:t>
+      </w:r>
+    </w:p>
+    <w:p>
+      <w:pPr>
+        <w:spacing w:after="20"/>
+        <w:ind w:left="510"/>
+      </w:pPr>
+      <w:r>
+        <w:rPr>
+          <w:rFonts w:ascii="Times New Roman" w:hAnsi="Times New Roman"/>
+          <w:b w:val="0"/>
+          <w:i w:val="0"/>
+          <w:color w:val="000000"/>
+          <w:sz w:val="16"/>
+        </w:rPr>
+        <w:t>lanja isam-bentin-kadiry: 1000 kg/m3</w:t>
+      </w:r>
+    </w:p>
+    <w:p>
+      <w:pPr>
+        <w:spacing w:after="20"/>
+        <w:ind w:left="510"/>
+      </w:pPr>
+      <w:r>
+        <w:rPr>
+          <w:rFonts w:ascii="Times New Roman" w:hAnsi="Times New Roman"/>
+          <w:b w:val="0"/>
+          <w:i w:val="0"/>
+          <w:color w:val="000000"/>
+          <w:sz w:val="16"/>
+        </w:rPr>
+        <w:t>hafanana spesifika: 4,18 J/gK</w:t>
+      </w:r>
+    </w:p>
+    <w:p>
+      <w:pPr>
+        <w:spacing w:after="20"/>
+        <w:ind w:left="510"/>
+      </w:pPr>
+      <w:r>
+        <w:rPr>
+          <w:rFonts w:ascii="Times New Roman" w:hAnsi="Times New Roman"/>
+          <w:b w:val="0"/>
+          <w:i w:val="0"/>
+          <w:color w:val="000000"/>
+          <w:sz w:val="16"/>
+        </w:rPr>
+        <w:t>mangarahara tsy miloko</w:t>
+      </w:r>
+    </w:p>
+    <w:p>
+      <w:pPr>
+        <w:spacing w:after="20"/>
+        <w:ind w:left="510"/>
+      </w:pPr>
+      <w:r>
+        <w:rPr>
+          <w:rFonts w:ascii="Times New Roman" w:hAnsi="Times New Roman"/>
+          <w:b w:val="0"/>
+          <w:i w:val="0"/>
+          <w:color w:val="000000"/>
+          <w:sz w:val="16"/>
+        </w:rPr>
+        <w:t>Misy fotoana ihany koa mety miloko manga indrindra ny ranomasina [2]</w:t>
+      </w:r>
+    </w:p>
+    <w:p>
+      <w:pPr>
+        <w:spacing w:after="20"/>
+        <w:ind w:left="510"/>
+      </w:pPr>
+      <w:r>
+        <w:rPr>
+          <w:rFonts w:ascii="Times New Roman" w:hAnsi="Times New Roman"/>
+          <w:b w:val="0"/>
+          <w:i w:val="0"/>
+          <w:color w:val="000000"/>
+          <w:sz w:val="16"/>
+        </w:rPr>
+        <w:t>Simia</w:t>
+      </w:r>
+    </w:p>
+    <w:p>
+      <w:pPr>
+        <w:spacing w:after="20"/>
+        <w:ind w:left="510"/>
+      </w:pPr>
+      <w:r>
+        <w:rPr>
+          <w:rFonts w:ascii="Times New Roman" w:hAnsi="Times New Roman"/>
+          <w:b w:val="0"/>
+          <w:i w:val="0"/>
+          <w:color w:val="000000"/>
+          <w:sz w:val="16"/>
+        </w:rPr>
+        <w:t>hanova</w:t>
+      </w:r>
+    </w:p>
+    <w:p>
+      <w:pPr>
+        <w:spacing w:after="20"/>
+        <w:ind w:left="510"/>
+      </w:pPr>
+      <w:r>
+        <w:rPr>
+          <w:rFonts w:ascii="Times New Roman" w:hAnsi="Times New Roman"/>
+          <w:b w:val="0"/>
+          <w:i w:val="0"/>
+          <w:color w:val="000000"/>
+          <w:sz w:val="16"/>
+        </w:rPr>
+        <w:t>H2O1 no raikipohy simikan'ny rano. Izany hoe misy atome Oksizena anankiray mitambatra amin'ny atome Hidrozena anankiroa. 18g ny lanjany isa-môly.</w:t>
+      </w:r>
+    </w:p>
+    <w:p>
+      <w:pPr>
+        <w:spacing w:after="20"/>
+        <w:ind w:left="510"/>
+      </w:pPr>
+      <w:r>
+        <w:rPr>
+          <w:rFonts w:ascii="Times New Roman" w:hAnsi="Times New Roman"/>
+          <w:b w:val="0"/>
+          <w:i w:val="0"/>
+          <w:color w:val="000000"/>
+          <w:sz w:val="16"/>
+        </w:rPr>
+        <w:t>Noho ny oksizena izay elektronegativa dia sintoniny manatona azy ny tambatra elektrona anankiroa izay eo amin'ny firaisany amin'ireo Hidrozena avy. Vokatr'izay dia lasa misy ampahana charge mitranga eo amin'ireo atoma tsirairay, miabo eo amin'ny H ary miiba eo amin'ny O. Noho ireo charges ireo dia lazaina fa polaire ny molekioln'ny rano. Mibaiko ny toetrany amin'ny ankapobeny io maha polaire azy io. Ohatra hoe:</w:t>
+      </w:r>
+    </w:p>
+    <w:p>
+      <w:pPr>
+        <w:spacing w:after="20"/>
+        <w:ind w:left="510"/>
+      </w:pPr>
+      <w:r>
+        <w:rPr>
+          <w:rFonts w:ascii="Times New Roman" w:hAnsi="Times New Roman"/>
+          <w:b w:val="0"/>
+          <w:i w:val="0"/>
+          <w:color w:val="000000"/>
+          <w:sz w:val="16"/>
+        </w:rPr>
+        <w:t>lasa misy firaisana malefaka amin'ny tendro miiba sy miabo amin'ny molekiolana rano mifanakaiky: firaisana Hidrozena no iantsoana azy; hany ka lasa manao tambajotram-piraisana malefaka ny molekiola maro rehefa tafaraka. Dia izany no mahatonga ny rano ho lasa mitsiranoka amin'ny mari-pana sy tsindry mahazatra raha toa ka mientona daholo ny akora mitovitovy lanja isa-môly aminy.</w:t>
+      </w:r>
+    </w:p>
+    <w:p>
+      <w:pPr>
+        <w:spacing w:after="20"/>
+        <w:ind w:left="510"/>
+      </w:pPr>
+      <w:r>
+        <w:rPr>
+          <w:rFonts w:ascii="Times New Roman" w:hAnsi="Times New Roman"/>
+          <w:b w:val="0"/>
+          <w:i w:val="0"/>
+          <w:color w:val="000000"/>
+          <w:sz w:val="16"/>
+        </w:rPr>
+        <w:t>afaka mifandray amin'ny molekiola polaire hafa ny rano amin'ny alalan'io firaisana malefaka io ihany. Toy izany no ahafahany mandevona an'ireo karazana asidra, alkalia ary sira isan-karazany; mbola toy izany koa no ahafahany mandevona siramamy; ary mbola toy izany koa no ahafahany mandena karazan'akora isan-karazany toy ny lamba, ny taratasy, ny hazo, sns. Antsoina koa hoe hidrofilika ireo akora polaires ireo.</w:t>
+      </w:r>
+    </w:p>
+    <w:p>
+      <w:pPr>
+        <w:spacing w:after="20"/>
+        <w:ind w:left="510"/>
+      </w:pPr>
+      <w:r>
+        <w:rPr>
+          <w:rFonts w:ascii="Times New Roman" w:hAnsi="Times New Roman"/>
+          <w:b w:val="0"/>
+          <w:i w:val="0"/>
+          <w:color w:val="000000"/>
+          <w:sz w:val="16"/>
+        </w:rPr>
+        <w:t>noho ireo firaisana malefaka amin'izy samy izy amin'ireo molekiola polaires dia tsy afaka tafangaro aminy ireo molekiola izay tsy mba misy faritra polaire. Voailika ireo noho izany ka tsy mahita toerana ho azy eo anivon'ny rehetra. Noho izany dia tafaraka tsy fidiny ny samy tsy polaire, dia manao firaisana malefaka kokoa, karazana firaisan'i Van Der Waals. Izany no mahatonga ny rano sy ny menaka tsy ho afaka mifangaro, izany koa no mahatonga ny rano tsy hahalena plastika, na lamosina ganagana. Antsoina koa hoe hidrofobika ireo akora tsy polaires ireo.</w:t>
+      </w:r>
+    </w:p>
+    <w:p>
+      <w:pPr>
+        <w:spacing w:after="20"/>
+        <w:ind w:left="510"/>
+      </w:pPr>
+      <w:r>
+        <w:rPr>
+          <w:rFonts w:ascii="Times New Roman" w:hAnsi="Times New Roman"/>
+          <w:b w:val="0"/>
+          <w:i w:val="0"/>
+          <w:color w:val="000000"/>
+          <w:sz w:val="16"/>
+        </w:rPr>
+        <w:t>Fiarahamonina</w:t>
+      </w:r>
+    </w:p>
+    <w:p>
+      <w:pPr>
+        <w:spacing w:after="20"/>
+        <w:ind w:left="510"/>
+      </w:pPr>
+      <w:r>
+        <w:rPr>
+          <w:rFonts w:ascii="Times New Roman" w:hAnsi="Times New Roman"/>
+          <w:b w:val="0"/>
+          <w:i w:val="0"/>
+          <w:color w:val="000000"/>
+          <w:sz w:val="16"/>
+        </w:rPr>
+        <w:t>hanova</w:t>
+      </w:r>
+    </w:p>
+    <w:p>
+      <w:pPr>
+        <w:spacing w:after="20"/>
+        <w:ind w:left="510"/>
+      </w:pPr>
+      <w:r>
+        <w:rPr>
+          <w:rFonts w:ascii="Times New Roman" w:hAnsi="Times New Roman"/>
+          <w:b w:val="0"/>
+          <w:i w:val="0"/>
+          <w:color w:val="000000"/>
+          <w:sz w:val="16"/>
+        </w:rPr>
+        <w:t>Manan-danja be amin'ny aina ny rano hany ka manan-danja amin'ny fiarahamonina koa. Entin'ny Malagasy hilazana ny fihavanana izay indraindrainy ny fampiarahana ny rano sy ny vary. Mbola itarafana ny fihavanana malagasy koa ny fomba fizaran-drano eny an-tanimbary, ka na miady aza ny tompon'ny tanimbary mifanao ambony sy ambany dia mahay mifanaraka foana amin'ny fizaran-drano.</w:t>
+      </w:r>
+    </w:p>
+    <w:p>
+      <w:pPr>
+        <w:spacing w:after="20"/>
+        <w:ind w:left="510"/>
+      </w:pPr>
+      <w:r>
+        <w:rPr>
+          <w:rFonts w:ascii="Times New Roman" w:hAnsi="Times New Roman"/>
+          <w:b w:val="0"/>
+          <w:i w:val="0"/>
+          <w:color w:val="000000"/>
+          <w:sz w:val="16"/>
+        </w:rPr>
+        <w:t>Any amin'ny tany efitra dia mamaritra ny politika ankapobeny mihitsy ny rano. Iadiana ny toerana avo ka andalovan'ny rano mialoha ny toerana hafa. Izay manana fahefana amin'ny rano no manana fahefana amin'ny rehetra.</w:t>
+      </w:r>
+    </w:p>
+    <w:p>
+      <w:pPr>
+        <w:spacing w:after="20"/>
+        <w:ind w:left="510"/>
+      </w:pPr>
+      <w:r>
+        <w:rPr>
+          <w:rFonts w:ascii="Times New Roman" w:hAnsi="Times New Roman"/>
+          <w:b w:val="0"/>
+          <w:i w:val="0"/>
+          <w:color w:val="000000"/>
+          <w:sz w:val="16"/>
+        </w:rPr>
+        <w:t>Misy mihitsy aza ireo kolontsaina sasany izay ahitana olona manao ny rano ho andriamanitra satria loharanon'ny aina.</w:t>
+      </w:r>
+    </w:p>
+    <w:p>
+      <w:pPr>
+        <w:spacing w:after="20"/>
+        <w:ind w:left="510"/>
+      </w:pPr>
+      <w:r>
+        <w:rPr>
+          <w:rFonts w:ascii="Times New Roman" w:hAnsi="Times New Roman"/>
+          <w:b w:val="0"/>
+          <w:i w:val="0"/>
+          <w:color w:val="000000"/>
+          <w:sz w:val="16"/>
+        </w:rPr>
+        <w:t>Fahasalamana</w:t>
+      </w:r>
+    </w:p>
+    <w:p>
+      <w:pPr>
+        <w:spacing w:after="20"/>
+        <w:ind w:left="510"/>
+      </w:pPr>
+      <w:r>
+        <w:rPr>
+          <w:rFonts w:ascii="Times New Roman" w:hAnsi="Times New Roman"/>
+          <w:b w:val="0"/>
+          <w:i w:val="0"/>
+          <w:color w:val="000000"/>
+          <w:sz w:val="16"/>
+        </w:rPr>
+        <w:t>hanova</w:t>
+      </w:r>
+    </w:p>
+    <w:p>
+      <w:pPr>
+        <w:spacing w:after="20"/>
+        <w:ind w:left="510"/>
+      </w:pPr>
+      <w:r>
+        <w:rPr>
+          <w:rFonts w:ascii="Times New Roman" w:hAnsi="Times New Roman"/>
+          <w:b w:val="0"/>
+          <w:i w:val="0"/>
+          <w:color w:val="000000"/>
+          <w:sz w:val="16"/>
+        </w:rPr>
+        <w:t>Ny rano dia sakafo mahavelona sy iankinan'ny aina. Ny 3/4 ny vatan'ny olombelona dia rano avokoa. Ary mila misotro rano isan'andro isika mba hikolokoloana an'io. Ankoatra ny maha rano azy dia mbola mety mitondra karazana sira mineraly izay ilain'ny vatana koa izy izay levona ao anatiny.</w:t>
+      </w:r>
+    </w:p>
+    <w:p>
+      <w:pPr>
+        <w:spacing w:after="20"/>
+        <w:ind w:left="510"/>
+      </w:pPr>
+      <w:r>
+        <w:rPr>
+          <w:rFonts w:ascii="Times New Roman" w:hAnsi="Times New Roman"/>
+          <w:b w:val="0"/>
+          <w:i w:val="0"/>
+          <w:color w:val="000000"/>
+          <w:sz w:val="16"/>
+        </w:rPr>
+        <w:t>Kanefa mila fitandremana betsaka ny rano sotroina satria mety mitondra mikiraoba isan-karazany ahiana hahatonga aretina. Anisan'ny aretina mety ho azo amin'ny fisotroana rano maloto ny kolera, ny bilarziozy, ny tefoedra sns. Tsara raha ampangotrahina ny rano vao sotroina, na farafaharatsiny ampiana fanafody tahaka ny Sur'Eau.</w:t>
+      </w:r>
+    </w:p>
+    <w:p>
+      <w:pPr>
+        <w:spacing w:after="20"/>
+        <w:ind w:left="510"/>
+      </w:pPr>
+      <w:r>
+        <w:rPr>
+          <w:rFonts w:ascii="Times New Roman" w:hAnsi="Times New Roman"/>
+          <w:b w:val="0"/>
+          <w:i w:val="0"/>
+          <w:color w:val="000000"/>
+          <w:sz w:val="16"/>
+        </w:rPr>
+        <w:t>Ny tsingerin'ny rano</w:t>
+      </w:r>
+    </w:p>
+    <w:p>
+      <w:pPr>
+        <w:spacing w:after="20"/>
+        <w:ind w:left="510"/>
+      </w:pPr>
+      <w:r>
+        <w:rPr>
+          <w:rFonts w:ascii="Times New Roman" w:hAnsi="Times New Roman"/>
+          <w:b w:val="0"/>
+          <w:i w:val="0"/>
+          <w:color w:val="000000"/>
+          <w:sz w:val="16"/>
+        </w:rPr>
+        <w:t>Jereo koa</w:t>
+      </w:r>
+    </w:p>
+    <w:p>
+      <w:pPr>
+        <w:spacing w:after="20"/>
+        <w:ind w:left="510"/>
+      </w:pPr>
+      <w:r>
+        <w:rPr>
+          <w:rFonts w:ascii="Times New Roman" w:hAnsi="Times New Roman"/>
+          <w:b w:val="0"/>
+          <w:i w:val="0"/>
+          <w:color w:val="000000"/>
+          <w:sz w:val="16"/>
+        </w:rPr>
+        <w:t>hanova</w:t>
+      </w:r>
+    </w:p>
+    <w:p>
+      <w:pPr>
+        <w:spacing w:after="20"/>
+        <w:ind w:left="510"/>
+      </w:pPr>
+      <w:r>
+        <w:rPr>
+          <w:rFonts w:ascii="Times New Roman" w:hAnsi="Times New Roman"/>
+          <w:b w:val="0"/>
+          <w:i w:val="0"/>
+          <w:color w:val="000000"/>
+          <w:sz w:val="16"/>
+        </w:rPr>
+        <w:t>Rano</w:t>
+      </w:r>
+    </w:p>
+    <w:p>
+      <w:pPr>
+        <w:spacing w:after="20"/>
+        <w:ind w:left="510"/>
+      </w:pPr>
+      <w:r>
+        <w:rPr>
+          <w:rFonts w:ascii="Times New Roman" w:hAnsi="Times New Roman"/>
+          <w:b w:val="0"/>
+          <w:i w:val="0"/>
+          <w:color w:val="000000"/>
+          <w:sz w:val="16"/>
+        </w:rPr>
+        <w:t>Rivotra</w:t>
+      </w:r>
+    </w:p>
+    <w:p>
+      <w:pPr>
+        <w:spacing w:after="20"/>
+        <w:ind w:left="510"/>
+      </w:pPr>
+      <w:r>
+        <w:rPr>
+          <w:rFonts w:ascii="Times New Roman" w:hAnsi="Times New Roman"/>
+          <w:b w:val="0"/>
+          <w:i w:val="0"/>
+          <w:color w:val="000000"/>
+          <w:sz w:val="16"/>
+        </w:rPr>
+        <w:t>Zavona</w:t>
+      </w:r>
+    </w:p>
+    <w:p>
+      <w:pPr>
+        <w:spacing w:after="20"/>
+        <w:ind w:left="510"/>
+      </w:pPr>
+      <w:r>
+        <w:rPr>
+          <w:rFonts w:ascii="Times New Roman" w:hAnsi="Times New Roman"/>
+          <w:b w:val="0"/>
+          <w:i w:val="0"/>
+          <w:color w:val="000000"/>
+          <w:sz w:val="16"/>
+        </w:rPr>
+        <w:t>Erika</w:t>
+      </w:r>
+    </w:p>
+    <w:p>
+      <w:pPr>
+        <w:spacing w:after="20"/>
+        <w:ind w:left="510"/>
+      </w:pPr>
+      <w:r>
+        <w:rPr>
+          <w:rFonts w:ascii="Times New Roman" w:hAnsi="Times New Roman"/>
+          <w:b w:val="0"/>
+          <w:i w:val="0"/>
+          <w:color w:val="000000"/>
+          <w:sz w:val="16"/>
+        </w:rPr>
+        <w:t>Ranomandry</w:t>
+      </w:r>
+    </w:p>
+    <w:p>
+      <w:pPr>
+        <w:spacing w:after="20"/>
+        <w:ind w:left="510"/>
+      </w:pPr>
+      <w:r>
+        <w:rPr>
+          <w:rFonts w:ascii="Times New Roman" w:hAnsi="Times New Roman"/>
+          <w:b w:val="0"/>
+          <w:i w:val="0"/>
+          <w:color w:val="000000"/>
+          <w:sz w:val="16"/>
+        </w:rPr>
+        <w:t>Havandra</w:t>
+      </w:r>
+    </w:p>
+    <w:p>
+      <w:pPr>
+        <w:spacing w:after="20"/>
+        <w:ind w:left="510"/>
+      </w:pPr>
+      <w:r>
+        <w:rPr>
+          <w:rFonts w:ascii="Times New Roman" w:hAnsi="Times New Roman"/>
+          <w:b w:val="0"/>
+          <w:i w:val="0"/>
+          <w:color w:val="000000"/>
+          <w:sz w:val="16"/>
+        </w:rPr>
+        <w:t>Oram-baratra</w:t>
+      </w:r>
+    </w:p>
+    <w:p>
+      <w:pPr>
+        <w:spacing w:after="20"/>
+        <w:ind w:left="510"/>
+      </w:pPr>
+      <w:r>
+        <w:rPr>
+          <w:rFonts w:ascii="Times New Roman" w:hAnsi="Times New Roman"/>
+          <w:b w:val="0"/>
+          <w:i w:val="0"/>
+          <w:color w:val="000000"/>
+          <w:sz w:val="16"/>
+        </w:rPr>
+        <w:t>Oram-panala</w:t>
+      </w:r>
+    </w:p>
+    <w:p>
+      <w:pPr>
+        <w:spacing w:after="20"/>
+        <w:ind w:left="510"/>
+      </w:pPr>
+      <w:r>
+        <w:rPr>
+          <w:rFonts w:ascii="Times New Roman" w:hAnsi="Times New Roman"/>
+          <w:b w:val="0"/>
+          <w:i w:val="0"/>
+          <w:color w:val="000000"/>
+          <w:sz w:val="16"/>
+        </w:rPr>
+        <w:t>Ando</w:t>
+      </w:r>
+    </w:p>
+    <w:p>
+      <w:pPr>
+        <w:spacing w:after="20"/>
+        <w:ind w:left="510"/>
+      </w:pPr>
+      <w:r>
+        <w:rPr>
+          <w:rFonts w:ascii="Times New Roman" w:hAnsi="Times New Roman"/>
+          <w:b w:val="0"/>
+          <w:i w:val="0"/>
+          <w:color w:val="000000"/>
+          <w:sz w:val="16"/>
+        </w:rPr>
+        <w:t>Singa efatra</w:t>
+      </w:r>
+    </w:p>
+    <w:p>
+      <w:pPr>
+        <w:spacing w:after="20"/>
+        <w:ind w:left="510"/>
+      </w:pPr>
+      <w:r>
+        <w:rPr>
+          <w:rFonts w:ascii="Times New Roman" w:hAnsi="Times New Roman"/>
+          <w:b w:val="0"/>
+          <w:i w:val="0"/>
+          <w:color w:val="000000"/>
+          <w:sz w:val="16"/>
+        </w:rPr>
+        <w:t>Referansa</w:t>
+      </w:r>
+    </w:p>
+    <w:p>
+      <w:pPr>
+        <w:spacing w:after="20"/>
+        <w:ind w:left="510"/>
+      </w:pPr>
+      <w:r>
+        <w:rPr>
+          <w:rFonts w:ascii="Times New Roman" w:hAnsi="Times New Roman"/>
+          <w:b w:val="0"/>
+          <w:i w:val="0"/>
+          <w:color w:val="000000"/>
+          <w:sz w:val="16"/>
+        </w:rPr>
+        <w:t>hanova</w:t>
+      </w:r>
+    </w:p>
+    <w:p>
+      <w:pPr>
+        <w:spacing w:after="20"/>
+        <w:ind w:left="510"/>
+      </w:pPr>
+      <w:r>
+        <w:rPr>
+          <w:rFonts w:ascii="Times New Roman" w:hAnsi="Times New Roman"/>
+          <w:b w:val="0"/>
+          <w:i w:val="0"/>
+          <w:color w:val="000000"/>
+          <w:sz w:val="16"/>
+        </w:rPr>
+        <w:t>1. https://mg.globalvoices.org/2022-12-26/161610/</w:t>
+      </w:r>
+    </w:p>
+    <w:p>
+      <w:pPr>
+        <w:spacing w:after="20"/>
+        <w:ind w:left="510"/>
+      </w:pPr>
+      <w:r>
+        <w:rPr>
+          <w:rFonts w:ascii="Times New Roman" w:hAnsi="Times New Roman"/>
+          <w:b w:val="0"/>
+          <w:i w:val="0"/>
+          <w:color w:val="000000"/>
+          <w:sz w:val="16"/>
+        </w:rPr>
+        <w:t>2. https://www.podcastscience.fm/dossiers/2011-03-04/pourquoi-la-couleur-de-locean-est-elle-bleue/</w:t>
+      </w:r>
+    </w:p>
+    <w:p>
+      <w:pPr>
+        <w:spacing w:after="20"/>
+        <w:ind w:left="510"/>
+      </w:pPr>
+      <w:r>
+        <w:rPr>
+          <w:rFonts w:ascii="Times New Roman" w:hAnsi="Times New Roman"/>
+          <w:b w:val="0"/>
+          <w:i w:val="0"/>
+          <w:color w:val="000000"/>
+          <w:sz w:val="16"/>
+        </w:rPr>
+        <w:t>Wikipedia</w:t>
+      </w:r>
+    </w:p>
+    <w:p>
+      <w:pPr>
+        <w:spacing w:after="20"/>
+        <w:ind w:left="510"/>
+      </w:pPr>
+      <w:r>
+        <w:rPr>
+          <w:rFonts w:ascii="Times New Roman" w:hAnsi="Times New Roman"/>
+          <w:b w:val="0"/>
+          <w:i w:val="0"/>
+          <w:color w:val="000000"/>
+          <w:sz w:val="16"/>
+        </w:rPr>
+        <w:t>Wikimedia Foundation</w:t>
+      </w:r>
+    </w:p>
+    <w:p>
+      <w:pPr>
+        <w:spacing w:after="20"/>
+        <w:ind w:left="510"/>
+      </w:pPr>
+      <w:r>
+        <w:rPr>
+          <w:rFonts w:ascii="Times New Roman" w:hAnsi="Times New Roman"/>
+          <w:b w:val="0"/>
+          <w:i w:val="0"/>
+          <w:color w:val="000000"/>
+          <w:sz w:val="16"/>
+        </w:rPr>
+        <w:t>Powered by MediaWiki</w:t>
+      </w:r>
+    </w:p>
+    <w:p>
+      <w:pPr>
+        <w:spacing w:after="20"/>
+        <w:ind w:left="510"/>
+      </w:pPr>
+      <w:r>
+        <w:rPr>
+          <w:rFonts w:ascii="Times New Roman" w:hAnsi="Times New Roman"/>
+          <w:b w:val="0"/>
+          <w:i w:val="0"/>
+          <w:color w:val="000000"/>
+          <w:sz w:val="16"/>
+        </w:rPr>
+        <w:t>Nadika tamin'ny Parsoid ny pejy.</w:t>
+      </w:r>
+    </w:p>
+    <w:p>
+      <w:pPr>
+        <w:spacing w:after="20"/>
+        <w:ind w:left="510"/>
+      </w:pPr>
+      <w:r>
+        <w:rPr>
+          <w:rFonts w:ascii="Times New Roman" w:hAnsi="Times New Roman"/>
+          <w:b w:val="0"/>
+          <w:i w:val="0"/>
+          <w:color w:val="000000"/>
+          <w:sz w:val="16"/>
+        </w:rPr>
+        <w:t>Mitondra ny lisansa CC BY-SA 4.0 ny votoatiny raha tsy misy zava-kafa ambara.</w:t>
+      </w:r>
+    </w:p>
+    <w:p>
+      <w:pPr>
+        <w:spacing w:after="20"/>
+        <w:ind w:left="510"/>
+      </w:pPr>
+      <w:r>
+        <w:rPr>
+          <w:rFonts w:ascii="Times New Roman" w:hAnsi="Times New Roman"/>
+          <w:b w:val="0"/>
+          <w:i w:val="0"/>
+          <w:color w:val="000000"/>
+          <w:sz w:val="16"/>
+        </w:rPr>
+        <w:t>Fitsipika momba ny zavatra tsy sarababem-bahoaka Contacts juridiques &amp; sécurité Fitsipi-pitondran-tena Mpanitatra Statistika Filazana momba ny kokizy Fepe-pampiasana Birao</w:t>
+      </w:r>
+    </w:p>
+    <w:p>
+      <w:pPr>
+        <w:spacing w:after="120"/>
+        <w:ind w:left="170"/>
+      </w:pPr>
+      <w:r>
+        <w:rPr>
+          <w:rFonts w:ascii="Times New Roman" w:hAnsi="Times New Roman"/>
+          <w:b/>
+          <w:i w:val="0"/>
+          <w:color w:val="000000"/>
+          <w:sz w:val="20"/>
+        </w:rPr>
+        <w:t>2. Wikipédia (fr) — « Hygiène des mains », encyclopédie en ligne, licence CC BY-SA 4.0</w:t>
       </w:r>
     </w:p>
     <w:p>
@@ -3867,7 +5163,7 @@
           <w:color w:val="000000"/>
           <w:sz w:val="20"/>
         </w:rPr>
-        <w:t>2. Ohabolana — « Ny nify, sady haingo no fahasalamana », ohabolana.org</w:t>
+        <w:t>3. Ohabolana — « Ny nify, sady haingo no fahasalamana », ohabolana.org</w:t>
       </w:r>
     </w:p>
     <w:p>
@@ -3915,7 +5211,7 @@
           <w:color w:val="000000"/>
           <w:sz w:val="20"/>
         </w:rPr>
-        <w:t>3. JICA / PAGEM — « Vakiteny Modely (Famakiana tantara) », manuels de langue malgache, rapport d'appui à l'éducation</w:t>
+        <w:t>4. JICA / PAGEM — « Vakiteny Modely (Famakiana tantara) », manuels de langue malgache, rapport d'appui à l'éducation</w:t>
       </w:r>
     </w:p>
     <w:p>
@@ -4111,7 +5407,39 @@
           <w:color w:val="000000"/>
           <w:sz w:val="22"/>
         </w:rPr>
-        <w:t>1. Wikipédia (fr) — « Hygiène des mains », encyclopédie en ligne, licence CC BY-SA 4.0</w:t>
+        <w:t>1. Wikipedia (mg) — « Rano », section « Fahasalamana », Wikipedia malagasy, vasontolo malalaka</w:t>
+      </w:r>
+    </w:p>
+    <w:p>
+      <w:pPr>
+        <w:spacing w:after="120"/>
+        <w:ind w:left="510"/>
+      </w:pPr>
+      <w:r>
+        <w:rPr>
+          <w:rFonts w:ascii="Times New Roman" w:hAnsi="Times New Roman"/>
+          <w:b w:val="0"/>
+          <w:i w:val="0"/>
+          <w:color w:val="1F4E79"/>
+          <w:sz w:val="20"/>
+        </w:rPr>
+        <w:t>https://mg.wikipedia.org/wiki/Rano</w:t>
+      </w:r>
+    </w:p>
+    <w:p>
+      <w:pPr>
+        <w:spacing w:after="120"/>
+        <w:ind w:left="227"/>
+      </w:pPr>
+      <w:r>
+        <w:rPr>
+          <w:rFonts w:ascii="Times New Roman" w:hAnsi="Times New Roman"/>
+          <w:b/>
+          <w:i w:val="0"/>
+          <w:color w:val="000000"/>
+          <w:sz w:val="22"/>
+        </w:rPr>
+        <w:t>2. Wikipédia (fr) — « Hygiène des mains », encyclopédie en ligne, licence CC BY-SA 4.0</w:t>
       </w:r>
     </w:p>
     <w:p>
@@ -4143,7 +5471,7 @@
           <w:color w:val="000000"/>
           <w:sz w:val="22"/>
         </w:rPr>
-        <w:t>2. Ohabolana — « Ny nify, sady haingo no fahasalamana », ohabolana.org</w:t>
+        <w:t>3. Ohabolana — « Ny nify, sady haingo no fahasalamana », ohabolana.org</w:t>
       </w:r>
     </w:p>
     <w:p>
@@ -4175,7 +5503,7 @@
           <w:color w:val="000000"/>
           <w:sz w:val="22"/>
         </w:rPr>
-        <w:t>3. JICA / PAGEM — « Vakiteny Modely (Famakiana tantara) », manuels de langue malgache, rapport d'appui à l'éducation</w:t>
+        <w:t>4. JICA / PAGEM — « Vakiteny Modely (Famakiana tantara) », manuels de langue malgache, rapport d'appui à l'éducation</w:t>
       </w:r>
     </w:p>
     <w:p>

</xml_diff>

<commit_message>
Contrôle nouveau : --fanamarinana (chaque mot d'une fiche doit avoir une trace locale) + application au pilote et au thème 1
Le contrôle compare les tokens des littéraux de données au vocabulaire réellement écrit dans le corpus
(PE T5 + pages collées + refs). Résultat : modèle V2 = 40 formes sans trace exacte sur 1 270 (les mots de
base du malgache et les impératifs vérifiés en ligne) ; fiche pilote = 66 ; thème 1 = 164 — c'est la file
d'attente des prochaines passes de langue.
Corrigé au passage : androavana -> ny lamba madio no ampiasaina amin'ny fanamainana ; tsy azo famelezana ->
tsy azo lavina ; la question « tsy tokony hadinoina » devient « tsy tokony hadinoana » (handina = oublier,
non mandinika = examiner). 10 .docx régénérés, tous TUATUA.

Co-authored-by: arena-agent <297053741+arena-agent@users.noreply.github.com>
</commit_message>
<xml_diff>
--- a/manuel-malagasy-t5/output/Echantillon_Malagasy_T5_V1.docx
+++ b/manuel-malagasy-t5/output/Echantillon_Malagasy_T5_V1.docx
@@ -2377,7 +2377,7 @@
                 <w:color w:val="000000"/>
                 <w:sz w:val="20"/>
               </w:rPr>
-              <w:t>2. Inona ny tapany amin'ny tanana tsy tokony hadinoina ?</w:t>
+              <w:t>2. Inona no tsy tokony hadinoana amin'ny fanasana ny tanana ?</w:t>
             </w:r>
           </w:p>
           <w:p>
@@ -2457,7 +2457,7 @@
                 <w:color w:val="000000"/>
                 <w:sz w:val="20"/>
               </w:rPr>
-              <w:t>2. Ny lamosin-tanana sy ny eo anelanelan'ny rantsan-tanana.</w:t>
+              <w:t>2. Ny lamosin-tanana sy ny eo anelanelan'ny rantsan-tanana, satria ao no mitahiry maloto.</w:t>
             </w:r>
           </w:p>
           <w:p>
@@ -2472,7 +2472,7 @@
                 <w:color w:val="000000"/>
                 <w:sz w:val="20"/>
               </w:rPr>
-              <w:t>3. Androavana amin'ny lamba madio.</w:t>
+              <w:t>3. Ny lamba madio no ampiasaina amin'ny fanamainana ny tanana.</w:t>
             </w:r>
           </w:p>
           <w:p>

</xml_diff>